<commit_message>
Simplify resume content for faster HR scanning
</commit_message>
<xml_diff>
--- a/Ken-Song-Resume.docx
+++ b/Ken-Song-Resume.docx
@@ -60,7 +60,7 @@
         </w:rPr>
         <w:t xml:space="preserve">Email：</w:t>
       </w:r>
-      <w:hyperlink w:history="1" r:id="rIdvojjalixl68xsoveko08n">
+      <w:hyperlink w:history="1" r:id="rIdhaatubefntpmfdrlhe_94">
         <w:r>
           <w:rPr>
             <w:color w:val="0F766E"/>
@@ -88,7 +88,7 @@
       <w:pPr>
         <w:spacing w:after="40"/>
       </w:pPr>
-      <w:hyperlink w:history="1" r:id="rIdmgncbujxibt4pvxruw6wm">
+      <w:hyperlink w:history="1" r:id="rIdfr1bgl6mau7zbty9_9wzz">
         <w:r>
           <w:rPr>
             <w:color w:val="0F766E"/>
@@ -111,7 +111,7 @@
         </w:rPr>
         <w:t xml:space="preserve">　|　</w:t>
       </w:r>
-      <w:hyperlink w:history="1" r:id="rIdaf1pjdlv2proxrqz6qbrk">
+      <w:hyperlink w:history="1" r:id="rIdewuvfvohji9zkvhua8vor">
         <w:r>
           <w:rPr>
             <w:color w:val="0F766E"/>
@@ -134,7 +134,7 @@
         </w:rPr>
         <w:t xml:space="preserve">　|　</w:t>
       </w:r>
-      <w:hyperlink w:history="1" r:id="rId9rr0nhbv5yedhobnjywkn">
+      <w:hyperlink w:history="1" r:id="rId6xoyt56nxwsxvensa9tjb">
         <w:r>
           <w:rPr>
             <w:color w:val="0F766E"/>
@@ -157,7 +157,7 @@
         </w:rPr>
         <w:t xml:space="preserve">　|　</w:t>
       </w:r>
-      <w:hyperlink w:history="1" r:id="rIdsqnvrdzvbpeyrpxmaxtbb">
+      <w:hyperlink w:history="1" r:id="rId6gesv41wnkihqdyvoewo1">
         <w:r>
           <w:rPr>
             <w:color w:val="0F766E"/>
@@ -180,7 +180,7 @@
         </w:rPr>
         <w:t xml:space="preserve">　|　</w:t>
       </w:r>
-      <w:hyperlink w:history="1" r:id="rIdhctog1advyrjnb-1hsbtd">
+      <w:hyperlink w:history="1" r:id="rIdktrfvf6auzuat5bbmiwmi">
         <w:r>
           <w:rPr>
             <w:color w:val="0F766E"/>
@@ -232,31 +232,55 @@
           <w:sz w:val="20"/>
           <w:szCs w:val="20"/>
         </w:rPr>
-        <w:t xml:space="preserve">專注 AI 應用開發的軟體工程師。我做的不是讓模型回答得漂亮，而是</w:t>
-      </w:r>
-      <w:r>
-        <w:rPr>
-          <w:b/>
-          <w:bCs/>
-          <w:i w:val="false"/>
-          <w:iCs w:val="false"/>
-          <w:color w:val="1E293B"/>
-          <w:sz w:val="20"/>
-          <w:szCs w:val="20"/>
-        </w:rPr>
-        <w:t xml:space="preserve">讓不合格的輸出進不了下游</w:t>
-      </w:r>
-      <w:r>
-        <w:rPr>
-          <w:b w:val="false"/>
-          <w:bCs w:val="false"/>
-          <w:i w:val="false"/>
-          <w:iCs w:val="false"/>
-          <w:color w:val="1E293B"/>
-          <w:sz w:val="20"/>
-          <w:szCs w:val="20"/>
-        </w:rPr>
-        <w:t xml:space="preserve">——在自製的互動式程式教學平台上，我用結構解析、瀏覽器實際載入與實際編譯執行建了一套規則式品質閘門，攔下 6 題標錯的正解、445 處會讓程式編譯不報錯卻輸出全錯的字串破壞，以及隨機出題器 12.63% 的異常率，修正後全部歸零，每一項都附得出實測輸出。後端以 Java／Spring Boot 3＋MySQL 8 獨立完成 Voyago 預訂平台（JWT、Google 登入後端驗證、登入限流、熱門查詢快取、N+1 優化、單元測試接 CI），前端以 Vue 3 Composition API 實作。架構決策與品質把關始終由我親手負責。2026/03–2026/09 任資訊科技老師，目前已離職、可立即上班。</w:t>
+        <w:t xml:space="preserve">AI 應用工程師。用結構解析、實際編譯與壓力測試替 AI 產出建品質閘門，把 </w:t>
+      </w:r>
+      <w:r>
+        <w:rPr>
+          <w:b/>
+          <w:bCs/>
+          <w:i w:val="false"/>
+          <w:iCs w:val="false"/>
+          <w:color w:val="1E293B"/>
+          <w:sz w:val="20"/>
+          <w:szCs w:val="20"/>
+        </w:rPr>
+        <w:t xml:space="preserve">445 處靜默錯誤</w:t>
+      </w:r>
+      <w:r>
+        <w:rPr>
+          <w:b w:val="false"/>
+          <w:bCs w:val="false"/>
+          <w:i w:val="false"/>
+          <w:iCs w:val="false"/>
+          <w:color w:val="1E293B"/>
+          <w:sz w:val="20"/>
+          <w:szCs w:val="20"/>
+        </w:rPr>
+        <w:t xml:space="preserve"> 與 </w:t>
+      </w:r>
+      <w:r>
+        <w:rPr>
+          <w:b/>
+          <w:bCs/>
+          <w:i w:val="false"/>
+          <w:iCs w:val="false"/>
+          <w:color w:val="1E293B"/>
+          <w:sz w:val="20"/>
+          <w:szCs w:val="20"/>
+        </w:rPr>
+        <w:t xml:space="preserve">12.63% 出題器異常率</w:t>
+      </w:r>
+      <w:r>
+        <w:rPr>
+          <w:b w:val="false"/>
+          <w:bCs w:val="false"/>
+          <w:i w:val="false"/>
+          <w:iCs w:val="false"/>
+          <w:color w:val="1E293B"/>
+          <w:sz w:val="20"/>
+          <w:szCs w:val="20"/>
+        </w:rPr>
+        <w:t xml:space="preserve"> 壓到 0；獨立完成 Java／Spring Boot 3＋Vue 3 全端專案 Voyago。目前已離職，可立即上班。</w:t>
       </w:r>
     </w:p>
     <w:p>
@@ -326,36 +350,19 @@
           <w:sz w:val="20"/>
           <w:szCs w:val="20"/>
         </w:rPr>
-        <w:t xml:space="preserve">很多人會用 AI 產內容，但少有人回答得出「你怎麼知道它產的是對的」。我的答案是把驗證做成可執行的流程：定義可檢查的條件、實際編譯執行、結構解析、壓力測試，不合格就攔下來。這套流程實際用在我自製的教學平台上，把 6 題錯答、445 處靜默錯誤與出題器 12.63% 的異常率全部歸零。</w:t>
-      </w:r>
-    </w:p>
-    <w:p>
-      <w:pPr>
-        <w:spacing w:after="100" w:line="276"/>
-      </w:pPr>
-      <w:r>
-        <w:rPr>
-          <w:b w:val="false"/>
-          <w:bCs w:val="false"/>
-          <w:i w:val="false"/>
-          <w:iCs w:val="false"/>
-          <w:color w:val="1E293B"/>
-          <w:sz w:val="20"/>
-          <w:szCs w:val="20"/>
-        </w:rPr>
-        <w:t xml:space="preserve">底下撐著的是完整的工程底子：Voyago 預訂平台的資料庫、後端 API 與前端畫面都由我一人完成，並處理了限流、快取、N+1 與後端權限控管；IoT 專題則完整走過軟硬整合到雲端回傳的鏈路。</w:t>
-      </w:r>
-      <w:r>
-        <w:rPr>
-          <w:b/>
-          <w:bCs/>
-          <w:i w:val="false"/>
-          <w:iCs w:val="false"/>
-          <w:color w:val="1E293B"/>
-          <w:sz w:val="20"/>
-          <w:szCs w:val="20"/>
-        </w:rPr>
-        <w:t xml:space="preserve">歡迎直接約時間聊聊，我可以當場展示作品集與 Demo。</w:t>
+        <w:t xml:space="preserve">我讓 AI 的輸出可被驗證，而不是看起來對就好——定義可檢查條件、實際編譯執行、結構解析、壓力測試，不合格就攔下來。工程底子扎實：Voyago 預訂平台資料庫、後端、前端一人包辦；IoT 專題走完整軟硬整合鏈路。</w:t>
+      </w:r>
+      <w:r>
+        <w:rPr>
+          <w:b/>
+          <w:bCs/>
+          <w:i w:val="false"/>
+          <w:iCs w:val="false"/>
+          <w:color w:val="1E293B"/>
+          <w:sz w:val="20"/>
+          <w:szCs w:val="20"/>
+        </w:rPr>
+        <w:t xml:space="preserve">歡迎直接約時間聊聊，我可以當場展示 Demo。</w:t>
       </w:r>
     </w:p>
     <w:p>
@@ -402,7 +409,7 @@
           <w:sz w:val="20"/>
           <w:szCs w:val="20"/>
         </w:rPr>
-        <w:t xml:space="preserve">LLM API 串接（Anthropic／OpenAI）實際用在教學內容自動化、文件轉結構化資料、網站內容生成與開發流程工具四類場景，並以 Prompt 設計與輸出驗證確保產出可交付。</w:t>
+        <w:t xml:space="preserve">LLM API 串接（Anthropic／OpenAI），用在教學內容自動化、文件結構化、網站生成與開發流程工具四類場景。</w:t>
       </w:r>
     </w:p>
     <w:p>
@@ -431,7 +438,7 @@
           <w:sz w:val="20"/>
           <w:szCs w:val="20"/>
         </w:rPr>
-        <w:t xml:space="preserve">替 AI 產出建可執行的驗證流程：結構解析、瀏覽器實際載入、實際編譯執行比對輸出、10 萬次壓測。實測攔下 6 題錯答、445 處靜默錯誤、出題器 12.63% 異常率，修正後全數歸零。</w:t>
+        <w:t xml:space="preserve">結構解析＋實際編譯執行＋10 萬次壓測，攔下 445 處靜默錯誤與 12.63% 異常率，修正後全數歸零。</w:t>
       </w:r>
     </w:p>
     <w:p>
@@ -460,7 +467,7 @@
           <w:sz w:val="20"/>
           <w:szCs w:val="20"/>
         </w:rPr>
-        <w:t xml:space="preserve">Voyago 預訂平台由我一人完成資料庫、後端 API 與前端：JWT＋BCrypt、Google 登入後端驗證、登入限流、Caffeine 快取、LAZY＋fetch join 解 N+1、後端 @PreAuthorize 權限控管、單元測試接 CI。</w:t>
+        <w:t xml:space="preserve">Voyago 預訂平台一人完成，含 JWT 驗證、登入限流、快取、N+1 優化、單元測試接 CI。</w:t>
       </w:r>
     </w:p>
     <w:p>
@@ -489,7 +496,7 @@
           <w:sz w:val="20"/>
           <w:szCs w:val="20"/>
         </w:rPr>
-        <w:t xml:space="preserve">曾任資訊科技老師，擅長把複雜技術講給非技術背景的人聽懂，具備清晰的文件與簡報能力。</w:t>
+        <w:t xml:space="preserve">曾任資訊科技老師，擅長把複雜技術講給非技術背景的人聽懂。</w:t>
       </w:r>
     </w:p>
     <w:p>
@@ -687,31 +694,14 @@
           <w:sz w:val="20"/>
           <w:szCs w:val="20"/>
         </w:rPr>
-        <w:t xml:space="preserve">資料庫、後端 API 與前端畫面由我一人完成。除了 CRUD，還補上課堂範例常跳過的部分：JWT＋BCrypt、Google ID Token 後端驗證、登入端點限流擋暴力破解、LAZY＋fetch join 解 N+1、熱門查詢上 Caffeine 快取、後端 @PreAuthorize 強制權限（STAFF 專屬端點前端被繞過也擋得住）、JUnit 5 單元測試接 GitHub Actions CI、springdoc 自動產 API 文件。</w:t>
-      </w:r>
-    </w:p>
-    <w:p>
-      <w:pPr>
-        <w:spacing w:after="40" w:line="276"/>
-      </w:pPr>
-      <w:r>
-        <w:rPr>
-          <w:b w:val="false"/>
-          <w:bCs w:val="false"/>
-          <w:i/>
-          <w:iCs/>
-          <w:color w:val="475569"/>
-          <w:sz w:val="20"/>
-          <w:szCs w:val="20"/>
-        </w:rPr>
-        <w:t xml:space="preserve">展示站跑的是純前端示範模式：免費後端閒置會睡、一睡 Demo 就變死連結，所以前端內建 mock fallback（同一套 UI 與 API 介面），註冊、登入、搜尋、下訂流程照樣走得完。完整三層可在本機一鍵啟動，面試時可當場跑。</w:t>
+        <w:t xml:space="preserve">資料庫、後端 API、前端畫面一人完成。JWT＋BCrypt、Google 登入驗證、登入限流、Caffeine 快取、N+1 優化、後端權限控管、單元測試接 CI。展示站為純前端示範模式，完整三層可本機一鍵啟動，面試時可當場跑。</w:t>
       </w:r>
     </w:p>
     <w:p>
       <w:pPr>
         <w:spacing w:after="140" w:line="276"/>
       </w:pPr>
-      <w:hyperlink w:history="1" r:id="rIdbyki-3o6ozykrponi7mn3">
+      <w:hyperlink w:history="1" r:id="rId9a_kl0roozzohftlrakim">
         <w:r>
           <w:rPr>
             <w:color w:val="0F766E"/>
@@ -734,7 +724,7 @@
         </w:rPr>
         <w:t xml:space="preserve">　/　</w:t>
       </w:r>
-      <w:hyperlink w:history="1" r:id="rIdnpljepz-gi93l8fx2atpm">
+      <w:hyperlink w:history="1" r:id="rIdf-99gqgz1ztmgmuxe-rpn">
         <w:r>
           <w:rPr>
             <w:color w:val="0F766E"/>
@@ -789,31 +779,14 @@
           <w:sz w:val="20"/>
           <w:szCs w:val="20"/>
         </w:rPr>
-        <w:t xml:space="preserve">自製 6 個互動教學檔、264 題、50 大題型，含教師逐節講解版與兩份互動模擬測驗。內容由 AI 協助產出，但不能直接拿去教——我建了一條驗證流程：結構解析 ＋ 瀏覽器實際載入互動 ＋ 實際編譯執行程式比對輸出 ＋ 出題器 10 萬次壓測，結論全附實測輸出。</w:t>
-      </w:r>
-    </w:p>
-    <w:p>
-      <w:pPr>
-        <w:spacing w:after="40" w:line="276"/>
-      </w:pPr>
-      <w:r>
-        <w:rPr>
-          <w:b w:val="false"/>
-          <w:bCs w:val="false"/>
-          <w:i w:val="false"/>
-          <w:iCs w:val="false"/>
-          <w:color w:val="475569"/>
-          <w:sz w:val="20"/>
-          <w:szCs w:val="20"/>
-        </w:rPr>
-        <w:t xml:space="preserve">閘門攔下並修正：正解標錯 6 題 → 0；選項重複／無法作答 2 題 → 0；字串破壞導致「編譯過但輸出全錯」445 處 → 0；程式編譯失敗 8 段 → 0（89 支全通過）；實際輸出與標示答案不符 19 題 → 0（75 題全一致）；JS 執行期錯誤、斷掉錨點與重複 id 共 81 處 → 0；隨機出題器異常率 12.63% → 0.000%（1 萬題壓測）。保留「通過／未通過品質閘門」兩個版本可現場對照。</w:t>
+        <w:t xml:space="preserve">自製 264 題互動教材，內容由 AI 協助產出。建立結構解析＋實際編譯執行＋10 萬次壓測的驗證流程，攔下 445 處靜默錯誤與 12.63% 出題器異常率，修正後全部歸零。</w:t>
       </w:r>
     </w:p>
     <w:p>
       <w:pPr>
         <w:spacing w:after="140" w:line="276"/>
       </w:pPr>
-      <w:hyperlink w:history="1" r:id="rIdde6cxifsg8xafihledfx0">
+      <w:hyperlink w:history="1" r:id="rIdc0hjhycwxwjalyivo506l">
         <w:r>
           <w:rPr>
             <w:color w:val="0F766E"/>
@@ -868,70 +841,8 @@
           <w:sz w:val="20"/>
           <w:szCs w:val="20"/>
         </w:rPr>
-        <w:t xml:space="preserve">以物聯網打造的溫度監控與即時警報門禁系統：高精度感測器持續監測環境溫度，由微控制器判斷是否超出安全閾值，異常時自動以無線模組推播警報並將數據上傳雲端，支援遠端監控。榮獲 2022 高雄發明展金牌，並累積專利申請與公開展示的完整經驗。</w:t>
-      </w:r>
-    </w:p>
-    <w:p>
-      <w:pPr>
-        <w:spacing w:after="40" w:before="60"/>
-      </w:pPr>
-      <w:r>
-        <w:rPr>
-          <w:b/>
-          <w:bCs/>
-          <w:i w:val="false"/>
-          <w:iCs w:val="false"/>
-          <w:color w:val="0F172A"/>
-          <w:sz w:val="20"/>
-          <w:szCs w:val="20"/>
-        </w:rPr>
-        <w:t xml:space="preserve">本作品集網站</w:t>
-      </w:r>
-      <w:r>
-        <w:rPr>
-          <w:b/>
-          <w:bCs/>
-          <w:i w:val="false"/>
-          <w:iCs w:val="false"/>
-          <w:color w:val="0F766E"/>
-          <w:sz w:val="20"/>
-          <w:szCs w:val="20"/>
-        </w:rPr>
-        <w:t xml:space="preserve">　AI 輔助開發</w:t>
-      </w:r>
-    </w:p>
-    <w:p>
-      <w:pPr>
-        <w:spacing w:after="40" w:line="276"/>
-      </w:pPr>
-      <w:r>
-        <w:rPr>
-          <w:b w:val="false"/>
-          <w:bCs w:val="false"/>
-          <w:i w:val="false"/>
-          <w:iCs w:val="false"/>
-          <w:color w:val="1E293B"/>
-          <w:sz w:val="20"/>
-          <w:szCs w:val="20"/>
-        </w:rPr>
-        <w:t xml:space="preserve">版面結構、RWD、SEO 與結構化資料皆親手規劃，並善用 Claude 等 AI 工具加速迭代與部署——展現把工程基礎與 AI 效率結合的開發方式。</w:t>
-      </w:r>
-    </w:p>
-    <w:p>
-      <w:pPr>
-        <w:spacing w:after="100" w:line="276"/>
-      </w:pPr>
-      <w:hyperlink w:history="1" r:id="rIdiagghryvm7iskvoduq38u">
-        <w:r>
-          <w:rPr>
-            <w:color w:val="0F766E"/>
-            <w:sz w:val="20"/>
-            <w:szCs w:val="20"/>
-            <w:u w:val="single"/>
-          </w:rPr>
-          <w:t xml:space="preserve">kensong0518.github.io/person-blog-master</w:t>
-        </w:r>
-      </w:hyperlink>
+        <w:t xml:space="preserve">感測器即時監測溫度，異常時無線推播警報並上雲端，支援遠端監控。完整走過軟硬整合到雲端回傳的鏈路。</w:t>
+      </w:r>
     </w:p>
     <w:p>
       <w:pPr>
@@ -1006,7 +917,7 @@
           <w:sz w:val="20"/>
           <w:szCs w:val="20"/>
         </w:rPr>
-        <w:t xml:space="preserve">資訊科技老師（資訊教育機構，2026/03–2026/09），負責把技術概念拆解、教會非本科背景的學生。</w:t>
+        <w:t xml:space="preserve">資訊科技老師（資訊教育機構，2026/03–2026/09）</w:t>
       </w:r>
     </w:p>
     <w:p>
@@ -1023,19 +934,19 @@
           <w:sz w:val="20"/>
           <w:szCs w:val="20"/>
         </w:rPr>
-        <w:t xml:space="preserve">AI 應用實作　</w:t>
-      </w:r>
-      <w:r>
-        <w:rPr>
-          <w:b w:val="false"/>
-          <w:bCs w:val="false"/>
-          <w:i w:val="false"/>
-          <w:iCs w:val="false"/>
-          <w:color w:val="1E293B"/>
-          <w:sz w:val="20"/>
-          <w:szCs w:val="20"/>
-        </w:rPr>
-        <w:t xml:space="preserve">把 LLM 接進四類實際場景：教學內容自動化、文件轉結構化資料、網站內容生成、開發流程工具；並替 AI 產出建規則式品質閘門，用實際編譯執行與壓力測試驗過才交付。</w:t>
+        <w:t xml:space="preserve">學歷　</w:t>
+      </w:r>
+      <w:r>
+        <w:rPr>
+          <w:b w:val="false"/>
+          <w:bCs w:val="false"/>
+          <w:i w:val="false"/>
+          <w:iCs w:val="false"/>
+          <w:color w:val="1E293B"/>
+          <w:sz w:val="20"/>
+          <w:szCs w:val="20"/>
+        </w:rPr>
+        <w:t xml:space="preserve">亞東科技大學 電子工程系（2019/09–2024/01）</w:t>
       </w:r>
     </w:p>
     <w:p>
@@ -1052,6 +963,35 @@
           <w:sz w:val="20"/>
           <w:szCs w:val="20"/>
         </w:rPr>
+        <w:t xml:space="preserve">進修　</w:t>
+      </w:r>
+      <w:r>
+        <w:rPr>
+          <w:b w:val="false"/>
+          <w:bCs w:val="false"/>
+          <w:i w:val="false"/>
+          <w:iCs w:val="false"/>
+          <w:color w:val="1E293B"/>
+          <w:sz w:val="20"/>
+          <w:szCs w:val="20"/>
+        </w:rPr>
+        <w:t xml:space="preserve">台大資訊系統訓練班（Java／Python／SQL／網頁設計）；TibaMe Java JDBC 與雲端服務開發課程。</w:t>
+      </w:r>
+    </w:p>
+    <w:p>
+      <w:pPr>
+        <w:spacing w:after="80" w:line="276"/>
+      </w:pPr>
+      <w:r>
+        <w:rPr>
+          <w:b/>
+          <w:bCs/>
+          <w:i w:val="false"/>
+          <w:iCs w:val="false"/>
+          <w:color w:val="0F766E"/>
+          <w:sz w:val="20"/>
+          <w:szCs w:val="20"/>
+        </w:rPr>
         <w:t xml:space="preserve">補強中　</w:t>
       </w:r>
       <w:r>
@@ -1064,7 +1004,7 @@
           <w:sz w:val="20"/>
           <w:szCs w:val="20"/>
         </w:rPr>
-        <w:t xml:space="preserve">RAG 檢索架構、MCP、Docker 地端部署、向量資料庫。這些尚未 ship，分開列。</w:t>
+        <w:t xml:space="preserve">RAG 檢索架構、MCP、Docker 地端部署、向量資料庫（尚未 ship，分開列）。</w:t>
       </w:r>
     </w:p>
     <w:p>
@@ -1081,93 +1021,6 @@
           <w:sz w:val="20"/>
           <w:szCs w:val="20"/>
         </w:rPr>
-        <w:t xml:space="preserve">學歷　</w:t>
-      </w:r>
-      <w:r>
-        <w:rPr>
-          <w:b w:val="false"/>
-          <w:bCs w:val="false"/>
-          <w:i w:val="false"/>
-          <w:iCs w:val="false"/>
-          <w:color w:val="1E293B"/>
-          <w:sz w:val="20"/>
-          <w:szCs w:val="20"/>
-        </w:rPr>
-        <w:t xml:space="preserve">亞東科技大學 電子工程系（2019/09–2024/01）</w:t>
-      </w:r>
-    </w:p>
-    <w:p>
-      <w:pPr>
-        <w:spacing w:after="80" w:line="276"/>
-      </w:pPr>
-      <w:r>
-        <w:rPr>
-          <w:b/>
-          <w:bCs/>
-          <w:i w:val="false"/>
-          <w:iCs w:val="false"/>
-          <w:color w:val="0F766E"/>
-          <w:sz w:val="20"/>
-          <w:szCs w:val="20"/>
-        </w:rPr>
-        <w:t xml:space="preserve">培訓進修　</w:t>
-      </w:r>
-      <w:r>
-        <w:rPr>
-          <w:b w:val="false"/>
-          <w:bCs w:val="false"/>
-          <w:i w:val="false"/>
-          <w:iCs w:val="false"/>
-          <w:color w:val="1E293B"/>
-          <w:sz w:val="20"/>
-          <w:szCs w:val="20"/>
-        </w:rPr>
-        <w:t xml:space="preserve">國立臺灣大學推廣教育資訊系統訓練班；緯育 TibaMe「Java JDBC 開發實作班」「Java 雲端服務開發技術養成班」。</w:t>
-      </w:r>
-    </w:p>
-    <w:p>
-      <w:pPr>
-        <w:spacing w:after="80" w:line="276"/>
-      </w:pPr>
-      <w:r>
-        <w:rPr>
-          <w:b/>
-          <w:bCs/>
-          <w:i w:val="false"/>
-          <w:iCs w:val="false"/>
-          <w:color w:val="0F766E"/>
-          <w:sz w:val="20"/>
-          <w:szCs w:val="20"/>
-        </w:rPr>
-        <w:t xml:space="preserve">自學擴充　</w:t>
-      </w:r>
-      <w:r>
-        <w:rPr>
-          <w:b w:val="false"/>
-          <w:bCs w:val="false"/>
-          <w:i w:val="false"/>
-          <w:iCs w:val="false"/>
-          <w:color w:val="1E293B"/>
-          <w:sz w:val="20"/>
-          <w:szCs w:val="20"/>
-        </w:rPr>
-        <w:t xml:space="preserve">透過 Hahow、Bilibili 等資源自學 Spring Boot、Vue、MyBatis、Spring MVC、Swagger、JavaWeb。</w:t>
-      </w:r>
-    </w:p>
-    <w:p>
-      <w:pPr>
-        <w:spacing w:after="80" w:line="276"/>
-      </w:pPr>
-      <w:r>
-        <w:rPr>
-          <w:b/>
-          <w:bCs/>
-          <w:i w:val="false"/>
-          <w:iCs w:val="false"/>
-          <w:color w:val="0F766E"/>
-          <w:sz w:val="20"/>
-          <w:szCs w:val="20"/>
-        </w:rPr>
         <w:t xml:space="preserve">獲獎 / 專利　</w:t>
       </w:r>
       <w:r>
@@ -1181,41 +1034,6 @@
           <w:szCs w:val="20"/>
         </w:rPr>
         <w:t xml:space="preserve">2022 高雄發明展金牌（IoT 智能門禁專題），並累積專利申請經驗。</w:t>
-      </w:r>
-    </w:p>
-    <w:p>
-      <w:pPr>
-        <w:pBdr>
-          <w:bottom w:val="single" w:color="0F766E" w:sz="8" w:space="2"/>
-        </w:pBdr>
-        <w:spacing w:after="60" w:before="280"/>
-      </w:pPr>
-      <w:r>
-        <w:rPr>
-          <w:b/>
-          <w:bCs/>
-          <w:color w:val="0F172A"/>
-          <w:sz w:val="24"/>
-          <w:szCs w:val="24"/>
-        </w:rPr>
-        <w:t xml:space="preserve">進修課程（台大資訊系統訓練班 結業）</w:t>
-      </w:r>
-    </w:p>
-    <w:p>
-      <w:pPr>
-        <w:spacing w:after="100" w:line="276"/>
-      </w:pPr>
-      <w:r>
-        <w:rPr>
-          <w:b w:val="false"/>
-          <w:bCs w:val="false"/>
-          <w:i w:val="false"/>
-          <w:iCs w:val="false"/>
-          <w:color w:val="1E293B"/>
-          <w:sz w:val="20"/>
-          <w:szCs w:val="20"/>
-        </w:rPr>
-        <w:t xml:space="preserve">Java 基礎與進階程式設計、Python 程式設計、SQL 資料分析、HTML5／CSS3／jQuery／Bootstrap 網頁設計、React Native 開發入門。</w:t>
       </w:r>
     </w:p>
     <w:sectPr>

</xml_diff>

<commit_message>
Update Voyago project description with new features
Add the WebSocket chat, async booking email, favorites backend, and
admin stats work to the portfolio site, online resume, and Word resume
so they describe the project's current scope.

Co-Authored-By: Claude Sonnet 5 <noreply@anthropic.com>
Claude-Session: https://claude.ai/code/session_018pGYbuqRB6AFdZVXCSM9jX
</commit_message>
<xml_diff>
--- a/Ken-Song-Resume.docx
+++ b/Ken-Song-Resume.docx
@@ -432,7 +432,7 @@
           <w:sz w:val="20"/>
           <w:szCs w:val="20"/>
         </w:rPr>
-        <w:t xml:space="preserve">Voyago 預訂平台一人完成，含 JWT 驗證、登入限流、快取、N+1 優化、單元測試接 CI。</w:t>
+        <w:t>Voyago 預訂平台一人完成，含 JWT 驗證、登入限流、快取、N+1 優化、WebSocket 即時通訊、非同步任務處理、單元測試＋整合測試接 CI。</w:t>
       </w:r>
     </w:p>
     <w:p>
@@ -537,7 +537,7 @@
           <w:sz w:val="20"/>
           <w:szCs w:val="20"/>
         </w:rPr>
-        <w:t xml:space="preserve">Java / Spring Boot 3、Python、RESTful API 設計、JWT 驗證、MySQL 8（schema 設計、查詢優化）、資料庫設計、Git</w:t>
+        <w:t>Java / Spring Boot 3、Python、RESTful API 設計、JWT 驗證、WebSocket / STOMP、非同步處理（@Async）、MySQL 8（schema 設計、查詢優化）、資料庫設計、整合測試（MockMvc）、Git</w:t>
       </w:r>
     </w:p>
     <w:p>
@@ -659,7 +659,7 @@
           <w:sz w:val="20"/>
           <w:szCs w:val="20"/>
         </w:rPr>
-        <w:t xml:space="preserve">資料庫、後端 API、前端畫面一人完成。JWT＋BCrypt、Google 登入驗證、登入限流、Caffeine 快取、N+1 優化、後端權限控管、單元測試接 CI。展示站為純前端示範模式，完整三層可本機一鍵啟動，面試時可當場跑。</w:t>
+        <w:t>資料庫、後端 API、前端畫面一人完成。JWT＋BCrypt、Google 登入驗證、登入限流、Caffeine 快取、N+1 優化、後端權限控管；再加上 WebSocket 即時客服聊天、付款後非同步 Email 通知、收藏功能真實後端化、STAFF 後台統計 API，單元測試＋Controller 整合測試接 CI。展示站為純前端示範模式，完整三層可本機一鍵啟動，面試時可當場跑。</w:t>
       </w:r>
     </w:p>
     <w:p>

</xml_diff>